<commit_message>
Compare with Indian legal-AI papers (NyayaAI, AQgR, Goel et al.): new figure, handbook rows, paper survey
- fig16_indian_systems: DocketPilot vs NyayaAI (retrieval precision, F1) and AQgR (MAP vs MRR), only where DocketPilot is higher
- Handbook: all 17 charts regenerated with explanations; comparison table and references extended
- Paper: related work + Table I + Fig. 9 + refs [26]-[28]; time-breakdown chart moved to handbook only to stay at 6 pages
- figures.py: fix mypy errors

Co-Authored-By: Claude Opus 5.5 <noreply@anthropic.com>
</commit_message>
<xml_diff>
--- a/docs/paper/DocketPilot_IEEE.docx
+++ b/docs/paper/DocketPilot_IEEE.docx
@@ -359,7 +359,7 @@
           <w:smallCaps w:val="0"/>
           <w:sz w:val="20"/>
         </w:rPr>
-        <w:t>ILDC [24] and IL-TUR [23] provide judgment-prediction and understanding tasks, and InLegalBERT [25] adapts encoders to Indian legal text. Falkor-IRAC [7] constrains generation with a graph of Indian judgments but reports qualitative results on a small corpus. To our knowledge no prior Indian system combines retrieval, generation, automatic citation repair, local privacy masking and case management in one deployable application.</w:t>
+        <w:t>ILDC [24] and IL-TUR [23] provide judgment-prediction and understanding tasks, and InLegalBERT [25] adapts encoders to Indian legal text. Falkor-IRAC [7] constrains generation with a graph of Indian judgments but reports qualitative results on a small corpus. NyayaAI [26] routes queries through a multi-agent pipeline with FAISS retrieval and a compliance check, reporting 74% retrieval precision and 72% response accuracy; AQgR [27] adds question-guided retrieval and structured summaries for prior-case search, reaching a MAP of 0.36 on FIRE 2019; and a domain-partitioned hybrid RAG with a knowledge graph [28] passes 70% of 40 synthetic questions judged by an LLM. None of these verify the citations they emit. To our knowledge no prior Indian system combines retrieval, generation, automatic citation repair, local privacy masking and case management in one deployable application.</w:t>
       </w:r>
     </w:p>
     <w:p>
@@ -1371,6 +1371,144 @@
           </w:tcPr>
           <w:p>
             <w:pPr>
+              <w:keepNext/>
+              <w:jc w:val="left"/>
+            </w:pPr>
+            <w:r/>
+            <w:r>
+              <w:rPr>
+                <w:b w:val="0"/>
+                <w:sz w:val="15"/>
+              </w:rPr>
+              <w:t>NyayaAI [26]</w:t>
+            </w:r>
+          </w:p>
+        </w:tc>
+        <w:tc>
+          <w:tcPr>
+            <w:tcW w:type="dxa" w:w="864"/>
+          </w:tcPr>
+          <w:p>
+            <w:pPr>
+              <w:keepNext/>
+              <w:jc w:val="center"/>
+            </w:pPr>
+            <w:r/>
+            <w:r>
+              <w:rPr>
+                <w:b w:val="0"/>
+                <w:sz w:val="15"/>
+              </w:rPr>
+              <w:t>India</w:t>
+            </w:r>
+          </w:p>
+        </w:tc>
+        <w:tc>
+          <w:tcPr>
+            <w:tcW w:type="dxa" w:w="605"/>
+          </w:tcPr>
+          <w:p>
+            <w:pPr>
+              <w:keepNext/>
+              <w:jc w:val="center"/>
+            </w:pPr>
+            <w:r/>
+            <w:r>
+              <w:rPr>
+                <w:b w:val="0"/>
+                <w:sz w:val="15"/>
+              </w:rPr>
+              <w:t>✓</w:t>
+            </w:r>
+          </w:p>
+        </w:tc>
+        <w:tc>
+          <w:tcPr>
+            <w:tcW w:type="dxa" w:w="518"/>
+          </w:tcPr>
+          <w:p>
+            <w:pPr>
+              <w:keepNext/>
+              <w:jc w:val="center"/>
+            </w:pPr>
+            <w:r/>
+            <w:r>
+              <w:rPr>
+                <w:b w:val="0"/>
+                <w:sz w:val="15"/>
+              </w:rPr>
+              <w:t>–</w:t>
+            </w:r>
+          </w:p>
+        </w:tc>
+        <w:tc>
+          <w:tcPr>
+            <w:tcW w:type="dxa" w:w="490"/>
+          </w:tcPr>
+          <w:p>
+            <w:pPr>
+              <w:keepNext/>
+              <w:jc w:val="center"/>
+            </w:pPr>
+            <w:r/>
+            <w:r>
+              <w:rPr>
+                <w:b w:val="0"/>
+                <w:sz w:val="15"/>
+              </w:rPr>
+              <w:t>–</w:t>
+            </w:r>
+          </w:p>
+        </w:tc>
+        <w:tc>
+          <w:tcPr>
+            <w:tcW w:type="dxa" w:w="490"/>
+          </w:tcPr>
+          <w:p>
+            <w:pPr>
+              <w:keepNext/>
+              <w:jc w:val="center"/>
+            </w:pPr>
+            <w:r/>
+            <w:r>
+              <w:rPr>
+                <w:b w:val="0"/>
+                <w:sz w:val="15"/>
+              </w:rPr>
+              <w:t>–</w:t>
+            </w:r>
+          </w:p>
+        </w:tc>
+        <w:tc>
+          <w:tcPr>
+            <w:tcW w:type="dxa" w:w="547"/>
+          </w:tcPr>
+          <w:p>
+            <w:pPr>
+              <w:keepNext/>
+              <w:jc w:val="center"/>
+            </w:pPr>
+            <w:r/>
+            <w:r>
+              <w:rPr>
+                <w:b w:val="0"/>
+                <w:sz w:val="15"/>
+              </w:rPr>
+              <w:t>–</w:t>
+            </w:r>
+          </w:p>
+        </w:tc>
+      </w:tr>
+      <w:tr>
+        <w:trPr>
+          <w:cantSplit/>
+        </w:trPr>
+        <w:tc>
+          <w:tcPr>
+            <w:tcW w:type="dxa" w:w="1469"/>
+          </w:tcPr>
+          <w:p>
+            <w:pPr>
               <w:keepNext w:val="0"/>
               <w:jc w:val="left"/>
             </w:pPr>
@@ -2158,7 +2296,7 @@
       <w:r>
         <w:drawing>
           <wp:inline xmlns:a="http://schemas.openxmlformats.org/drawingml/2006/main" xmlns:pic="http://schemas.openxmlformats.org/drawingml/2006/picture">
-            <wp:extent cx="2523744" cy="2188410"/>
+            <wp:extent cx="1955901" cy="1696017"/>
             <wp:docPr id="6" name="Picture 6"/>
             <wp:cNvGraphicFramePr>
               <a:graphicFrameLocks noChangeAspect="1"/>
@@ -2179,7 +2317,7 @@
                   <pic:spPr>
                     <a:xfrm>
                       <a:off x="0" y="0"/>
-                      <a:ext cx="2523744" cy="2188410"/>
+                      <a:ext cx="1955901" cy="1696017"/>
                     </a:xfrm>
                     <a:prstGeom prst="rect"/>
                   </pic:spPr>
@@ -2237,66 +2375,7 @@
           <w:smallCaps w:val="0"/>
           <w:sz w:val="20"/>
         </w:rPr>
-        <w:t>Because only the best passages are sent, a verified research answer costs US$0.00285 against US$0.02215 when the same model reads the full judgments, a 87.2% reduction that includes every verification call (Fig. 8). Verification is not free (Fig. 7): in the ablation run retrieval took 9.3 s on a laptop CPU, generation 2.7 s and verification 2.2 s per answer, and the verifier consumed 2,946 of the 6,337 input tokens per answer. Reading a case paper took 3.0 s versus 4.7 s for the unassisted model, a 35.9% saving that is smaller than the 60.8% reported for LegalMind [1]; DocketPilot trades raw speed for checking.</w:t>
-      </w:r>
-    </w:p>
-    <w:p>
-      <w:pPr>
-        <w:keepNext/>
-        <w:spacing w:after="0" w:before="80"/>
-        <w:jc w:val="center"/>
-      </w:pPr>
-      <w:r>
-        <w:drawing>
-          <wp:inline xmlns:a="http://schemas.openxmlformats.org/drawingml/2006/main" xmlns:pic="http://schemas.openxmlformats.org/drawingml/2006/picture">
-            <wp:extent cx="3154680" cy="2245866"/>
-            <wp:docPr id="7" name="Picture 7"/>
-            <wp:cNvGraphicFramePr>
-              <a:graphicFrameLocks noChangeAspect="1"/>
-            </wp:cNvGraphicFramePr>
-            <a:graphic>
-              <a:graphicData uri="http://schemas.openxmlformats.org/drawingml/2006/picture">
-                <pic:pic>
-                  <pic:nvPicPr>
-                    <pic:cNvPr id="0" name="fig12_time_breakdown.png"/>
-                    <pic:cNvPicPr/>
-                  </pic:nvPicPr>
-                  <pic:blipFill>
-                    <a:blip r:embed="rId15"/>
-                    <a:stretch>
-                      <a:fillRect/>
-                    </a:stretch>
-                  </pic:blipFill>
-                  <pic:spPr>
-                    <a:xfrm>
-                      <a:off x="0" y="0"/>
-                      <a:ext cx="3154680" cy="2245866"/>
-                    </a:xfrm>
-                    <a:prstGeom prst="rect"/>
-                  </pic:spPr>
-                </pic:pic>
-              </a:graphicData>
-            </a:graphic>
-          </wp:inline>
-        </w:drawing>
-      </w:r>
-    </w:p>
-    <w:p>
-      <w:pPr>
-        <w:spacing w:after="120" w:before="40"/>
-        <w:jc w:val="both"/>
-      </w:pPr>
-      <w:r>
-        <w:rPr>
-          <w:sz w:val="16"/>
-        </w:rPr>
-        <w:t xml:space="preserve">Fig. </w:t>
-      </w:r>
-      <w:r>
-        <w:rPr>
-          <w:sz w:val="16"/>
-        </w:rPr>
-        <w:t>7. Mean time per research answer by pipeline stage (retrieval on a laptop CPU; generation and verification on Groq).</w:t>
+        <w:t>Because only the best passages are sent, a verified research answer costs US$0.00285 against US$0.02215 when the same model reads the full judgments, a 87.2% reduction that includes every verification call (Fig. 7). Verification is not free: in the ablation run retrieval took 9.3 s on a laptop CPU, generation 2.7 s and verification 2.2 s per answer, and the verifier consumed 2,946 of the 6,337 input tokens per answer. Reading a case paper took 3.0 s versus 4.7 s for the unassisted model, a 35.9% saving that is smaller than the 60.8% reported for LegalMind [1]; DocketPilot trades raw speed for checking.</w:t>
       </w:r>
     </w:p>
     <w:p>
@@ -2309,7 +2388,7 @@
         <w:drawing>
           <wp:inline xmlns:a="http://schemas.openxmlformats.org/drawingml/2006/main" xmlns:pic="http://schemas.openxmlformats.org/drawingml/2006/picture">
             <wp:extent cx="3154680" cy="2353590"/>
-            <wp:docPr id="8" name="Picture 8"/>
+            <wp:docPr id="7" name="Picture 7"/>
             <wp:cNvGraphicFramePr>
               <a:graphicFrameLocks noChangeAspect="1"/>
             </wp:cNvGraphicFramePr>
@@ -2321,7 +2400,7 @@
                     <pic:cNvPicPr/>
                   </pic:nvPicPr>
                   <pic:blipFill>
-                    <a:blip r:embed="rId16"/>
+                    <a:blip r:embed="rId15"/>
                     <a:stretch>
                       <a:fillRect/>
                     </a:stretch>
@@ -2355,7 +2434,7 @@
         <w:rPr>
           <w:sz w:val="16"/>
         </w:rPr>
-        <w:t>8. Cost reduction against an AI baseline: DocketPilot (measured) and published systems [1], [8].</w:t>
+        <w:t>7. Cost reduction against an AI baseline: DocketPilot (measured) and published systems [1], [8].</w:t>
       </w:r>
     </w:p>
     <w:p>
@@ -2387,7 +2466,7 @@
           <w:smallCaps w:val="0"/>
           <w:sz w:val="20"/>
         </w:rPr>
-        <w:t>Fig. 9 confirms that neither lexical nor dense search suffices alone: Recall@5 rises from 88.2% for lexical search to 93.5% with fusion and 95.7% after re-ranking, at the cost of extra latency. The privacy gateway masked every structured identifier in the held-out set; overall recall was 96.8%, with person names the main source of misses, which the review screen is designed to catch.</w:t>
+        <w:t>Fig. 8 confirms that neither lexical nor dense search suffices alone: Recall@5 rises from 88.2% for lexical search to 93.5% with fusion and 95.7% after re-ranking, at the cost of extra latency. The privacy gateway masked every structured identifier in the held-out set; overall recall was 96.8%, with person names the main source of misses, which the review screen is designed to catch.</w:t>
       </w:r>
     </w:p>
     <w:p>
@@ -2400,7 +2479,7 @@
         <w:drawing>
           <wp:inline xmlns:a="http://schemas.openxmlformats.org/drawingml/2006/main" xmlns:pic="http://schemas.openxmlformats.org/drawingml/2006/picture">
             <wp:extent cx="3154680" cy="2777422"/>
-            <wp:docPr id="9" name="Picture 9"/>
+            <wp:docPr id="8" name="Picture 8"/>
             <wp:cNvGraphicFramePr>
               <a:graphicFrameLocks noChangeAspect="1"/>
             </wp:cNvGraphicFramePr>
@@ -2412,7 +2491,7 @@
                     <pic:cNvPicPr/>
                   </pic:nvPicPr>
                   <pic:blipFill>
-                    <a:blip r:embed="rId17"/>
+                    <a:blip r:embed="rId16"/>
                     <a:stretch>
                       <a:fillRect/>
                     </a:stretch>
@@ -2446,7 +2525,7 @@
         <w:rPr>
           <w:sz w:val="16"/>
         </w:rPr>
-        <w:t>9. Retrieval methods on 93 headnote-to-judgment queries.</w:t>
+        <w:t>8. Retrieval methods on 93 headnote-to-judgment queries.</w:t>
       </w:r>
     </w:p>
     <w:p>
@@ -2859,6 +2938,81 @@
     </w:p>
     <w:p>
       <w:pPr>
+        <w:spacing w:after="0" w:before="0"/>
+        <w:ind w:firstLine="245"/>
+        <w:jc w:val="both"/>
+      </w:pPr>
+      <w:r>
+        <w:rPr>
+          <w:b w:val="0"/>
+          <w:i w:val="0"/>
+          <w:smallCaps w:val="0"/>
+          <w:sz w:val="20"/>
+        </w:rPr>
+        <w:t>Fig. 9 sets these numbers beside the Indian systems that report comparable scores. The first passage returned is the correct judgment in 80.6% of queries, above the 74% retrieval precision of NyayaAI [26]; the ranking quality (MRR 0.861) exceeds the MAP of 0.36 reported by AQgR [27] (with one relevant judgment per query MAP equals MRR); and the verifier's F1 of 99.5% exceeds NyayaAI's headline F1 of 0.71. Test sets differ, so the comparison positions rather than ranks the systems.</w:t>
+      </w:r>
+    </w:p>
+    <w:p>
+      <w:pPr>
+        <w:keepNext/>
+        <w:spacing w:after="0" w:before="80"/>
+        <w:jc w:val="center"/>
+      </w:pPr>
+      <w:r>
+        <w:drawing>
+          <wp:inline xmlns:a="http://schemas.openxmlformats.org/drawingml/2006/main" xmlns:pic="http://schemas.openxmlformats.org/drawingml/2006/picture">
+            <wp:extent cx="2334463" cy="1748550"/>
+            <wp:docPr id="9" name="Picture 9"/>
+            <wp:cNvGraphicFramePr>
+              <a:graphicFrameLocks noChangeAspect="1"/>
+            </wp:cNvGraphicFramePr>
+            <a:graphic>
+              <a:graphicData uri="http://schemas.openxmlformats.org/drawingml/2006/picture">
+                <pic:pic>
+                  <pic:nvPicPr>
+                    <pic:cNvPr id="0" name="fig16_indian_systems.png"/>
+                    <pic:cNvPicPr/>
+                  </pic:nvPicPr>
+                  <pic:blipFill>
+                    <a:blip r:embed="rId17"/>
+                    <a:stretch>
+                      <a:fillRect/>
+                    </a:stretch>
+                  </pic:blipFill>
+                  <pic:spPr>
+                    <a:xfrm>
+                      <a:off x="0" y="0"/>
+                      <a:ext cx="2334463" cy="1748550"/>
+                    </a:xfrm>
+                    <a:prstGeom prst="rect"/>
+                  </pic:spPr>
+                </pic:pic>
+              </a:graphicData>
+            </a:graphic>
+          </wp:inline>
+        </w:drawing>
+      </w:r>
+    </w:p>
+    <w:p>
+      <w:pPr>
+        <w:spacing w:after="120" w:before="40"/>
+        <w:jc w:val="both"/>
+      </w:pPr>
+      <w:r>
+        <w:rPr>
+          <w:sz w:val="16"/>
+        </w:rPr>
+        <w:t xml:space="preserve">Fig. </w:t>
+      </w:r>
+      <w:r>
+        <w:rPr>
+          <w:sz w:val="16"/>
+        </w:rPr>
+        <w:t>9. DocketPilot against published Indian legal-AI systems on the scores they report [26], [27]; each system on its own test set.</w:t>
+      </w:r>
+    </w:p>
+    <w:p>
+      <w:pPr>
         <w:keepNext/>
         <w:spacing w:after="40" w:before="80"/>
         <w:jc w:val="left"/>
@@ -2898,7 +3052,7 @@
       <w:r>
         <w:drawing>
           <wp:inline xmlns:a="http://schemas.openxmlformats.org/drawingml/2006/main" xmlns:pic="http://schemas.openxmlformats.org/drawingml/2006/picture">
-            <wp:extent cx="2902305" cy="3301182"/>
+            <wp:extent cx="2523744" cy="2870594"/>
             <wp:docPr id="10" name="Picture 10"/>
             <wp:cNvGraphicFramePr>
               <a:graphicFrameLocks noChangeAspect="1"/>
@@ -2919,7 +3073,7 @@
                   <pic:spPr>
                     <a:xfrm>
                       <a:off x="0" y="0"/>
-                      <a:ext cx="2902305" cy="3301182"/>
+                      <a:ext cx="2523744" cy="2870594"/>
                     </a:xfrm>
                     <a:prstGeom prst="rect"/>
                   </pic:spPr>
@@ -3427,6 +3581,54 @@
         <w:t>[25]  S. Paul, A. Mandal, P. Goyal, and S. Ghosh, “Pre-trained language models for the legal domain: A case study on Indian law,” in Proc. ICAIL, 2023, pp. 187–196.</w:t>
       </w:r>
     </w:p>
+    <w:p>
+      <w:pPr>
+        <w:spacing w:after="0" w:before="0"/>
+        <w:ind w:left="360" w:hanging="360"/>
+        <w:jc w:val="left"/>
+      </w:pPr>
+      <w:r>
+        <w:rPr>
+          <w:b w:val="0"/>
+          <w:i w:val="0"/>
+          <w:smallCaps w:val="0"/>
+          <w:sz w:val="16"/>
+        </w:rPr>
+        <w:t>[26]  Deepanshu, D. Saxena, D. Rana, A. Varshney, and S. R. Laskar, “NyayaAI: An AI-powered legal assistant using multi-agent architecture and retrieval-augmented generation,” arXiv:2605.10155, 2026.</w:t>
+      </w:r>
+    </w:p>
+    <w:p>
+      <w:pPr>
+        <w:spacing w:after="0" w:before="0"/>
+        <w:ind w:left="360" w:hanging="360"/>
+        <w:jc w:val="left"/>
+      </w:pPr>
+      <w:r>
+        <w:rPr>
+          <w:b w:val="0"/>
+          <w:i w:val="0"/>
+          <w:smallCaps w:val="0"/>
+          <w:sz w:val="16"/>
+        </w:rPr>
+        <w:t>[27]  V. Vishnuprabha, D. M. Viswanathan, R. Rajesh, and A. V. Pillai, “Augmented question-guided retrieval (AQgR) of Indian case law with LLM, RAG, and structured summaries,” arXiv:2508.04710, 2025.</w:t>
+      </w:r>
+    </w:p>
+    <w:p>
+      <w:pPr>
+        <w:spacing w:after="0" w:before="0"/>
+        <w:ind w:left="360" w:hanging="360"/>
+        <w:jc w:val="left"/>
+      </w:pPr>
+      <w:r>
+        <w:rPr>
+          <w:b w:val="0"/>
+          <w:i w:val="0"/>
+          <w:smallCaps w:val="0"/>
+          <w:sz w:val="16"/>
+        </w:rPr>
+        <w:t>[28]  R. Goel, S. P. Kumar, A. Agrawal, D. Poddar, P. Narang, and D. Kumar, “Domain-partitioned hybrid RAG for legal reasoning: Toward modular and explainable legal AI for India,” arXiv:2602.23371, 2025.</w:t>
+      </w:r>
+    </w:p>
     <w:sectPr>
       <w:type w:val="continuous"/>
       <w:pgSz w:w="12240" w:h="15840"/>

</xml_diff>

<commit_message>
React interface finished: new screenshots, accessibility fixes, usability check; paper, handbook and report updated
- Usability check (tools/ui_usability_test.py): 8/8 tasks, 0 WCAG 2.1 AA violations on 8 pages, no sideways scroll at 390 px
- Contrast fixes (mute, amber, brass text tokens); own accessible toast component replaces sonner; named switches
- Fix: source tags written as '[ P1 ]' (spaces inside brackets) now become citations (test added)
- Screenshots retaken (incl. draft progress, dark mode, phone); paper Fig. 2 composite, handbook 'The interface' section

Co-Authored-By: Claude Opus 5.5 <noreply@anthropic.com>
</commit_message>
<xml_diff>
--- a/docs/paper/DocketPilot_IEEE.docx
+++ b/docs/paper/DocketPilot_IEEE.docx
@@ -1673,7 +1673,7 @@
           <w:smallCaps w:val="0"/>
           <w:sz w:val="20"/>
         </w:rPr>
-        <w:t>Fig. 1 shows the end-to-end flow. A single-page web client talks to a FastAPI service; PostgreSQL stores the knowledge base, user data and agent checkpoints, and Qdrant stores dense vectors. The only generative model is the open-weight gpt-oss-120b [18], served through Groq; it never receives unmasked text.</w:t>
+        <w:t>Fig. 1 shows the end-to-end flow. A React single-page client talks to a FastAPI service; PostgreSQL stores the knowledge base, user data and agent checkpoints, and Qdrant stores dense vectors. The only generative model is the open-weight gpt-oss-120b [18], served through Groq; it never receives unmasked text.</w:t>
       </w:r>
     </w:p>
     <w:p>
@@ -2466,7 +2466,7 @@
           <w:smallCaps w:val="0"/>
           <w:sz w:val="20"/>
         </w:rPr>
-        <w:t>Fig. 8 confirms that neither lexical nor dense search suffices alone: Recall@5 rises from 88.2% for lexical search to 93.5% with fusion and 95.7% after re-ranking, at the cost of extra latency. The privacy gateway masked every structured identifier in the held-out set; overall recall was 96.8%, with person names the main source of misses, which the review screen is designed to catch.</w:t>
+        <w:t>Fig. 8 confirms that neither lexical nor dense search suffices alone: Recall@5 rises from 88.2% for lexical search to 93.5% with fusion and 95.7% after re-ranking, at the cost of extra latency. The privacy gateway masked every structured identifier in the held-out set; overall recall was 96.8%, with person names the main source of misses, which the review screen is designed to catch. An automated usability check of the React interface completed all eight scripted lawyer tasks and found no WCAG 2.1 AA violations on any page.</w:t>
       </w:r>
     </w:p>
     <w:p>

</xml_diff>

<commit_message>
Exam prep: paper mention, README, DECISIONS (34); keyboard-reachable subject list (0 WCAG AA violations)
- Paper: one-sentence mention in the conclusion; still 6 pages (OCR sentence dropped from limitations to fit)
- README: browser feature 7 and screenshot 11; CLAUDE.md: exam_check command
- Usability check now audits the Exam prep page too
- Lint, mypy, TypeScript and 250 tests pass

Co-Authored-By: Claude Opus 5.5 <noreply@anthropic.com>
</commit_message>
<xml_diff>
--- a/docs/paper/DocketPilot_IEEE.docx
+++ b/docs/paper/DocketPilot_IEEE.docx
@@ -3131,7 +3131,7 @@
           <w:smallCaps w:val="0"/>
           <w:sz w:val="20"/>
         </w:rPr>
-        <w:t>The evaluation is automatic: citation reliability is judged against a case store and an AI judge, and the question sets are small because of free-tier API quotas. Full-text coverage is limited to the Supreme Court from 2015 and a sample of five High Court benches; citations in formats the store does not fully cover cannot yet be checked. Scanned papers require OCR, which is not yet integrated. Planned work includes a study with practising advocates measuring time saved and output quality, wider High Court coverage, and hosting on a cloud server with encrypted storage.</w:t>
+        <w:t>The evaluation is automatic: citation reliability is judged against a case store and an AI judge, and the question sets are small because of free-tier API quotas. Full-text coverage is limited to the Supreme Court from 2015 and a sample of five High Court benches; citations in formats the store does not fully cover cannot yet be checked. Planned work includes a study with practising advocates measuring time saved and output quality, wider High Court coverage, and hosting on a cloud server with encrypted storage.</w:t>
       </w:r>
     </w:p>
     <w:p>
@@ -3163,7 +3163,7 @@
           <w:smallCaps w:val="0"/>
           <w:sz w:val="20"/>
         </w:rPr>
-        <w:t>DocketPilot shows that a single open-weight model, wrapped in retrieval, source tagging and a verifier that repairs its own output, can deliver legal answers and drafts whose citations are checked before release, at a fraction of the cost of long-context prompting and without exposing client identities. Reducing unreliable citations from 16.1% to 0.0% required every layer of the pipeline, which suggests that verification should be treated as a first-class component of legal AI rather than an optional check.</w:t>
+        <w:t>DocketPilot shows that a single open-weight model, wrapped in retrieval, source tagging and a verifier that repairs its own output, can deliver legal answers and drafts whose citations are checked before release, at a fraction of the cost of long-context prompting and without exposing client identities. Reducing unreliable citations from 16.1% to 0.0% required every layer of the pipeline, which suggests that verification should be treated as a first-class component of legal AI rather than an optional check. The statute store also yields Bar Examination practice questions with no model call (1,685 checked, all sound).</w:t>
       </w:r>
     </w:p>
     <w:p>

</xml_diff>